<commit_message>
feat: adding touched up resumes
</commit_message>
<xml_diff>
--- a/public/carlos-monti-ats-cv.docx
+++ b/public/carlos-monti-ats-cv.docx
@@ -138,12 +138,12 @@
           <wp:inline distB="19050" distT="19050" distL="19050" distR="19050">
             <wp:extent cx="93472" cy="177597"/>
             <wp:effectExtent b="0" l="0" r="0" t="0"/>
-            <wp:docPr descr="mobile-alt" id="1" name="image3.png"/>
+            <wp:docPr descr="mobile-alt" id="1" name="image1.png"/>
             <a:graphic>
               <a:graphicData uri="http://schemas.openxmlformats.org/drawingml/2006/picture">
                 <pic:pic>
                   <pic:nvPicPr>
-                    <pic:cNvPr descr="mobile-alt" id="0" name="image3.png"/>
+                    <pic:cNvPr descr="mobile-alt" id="0" name="image1.png"/>
                     <pic:cNvPicPr preferRelativeResize="0"/>
                   </pic:nvPicPr>
                   <pic:blipFill>
@@ -179,12 +179,12 @@
           <wp:inline distB="19050" distT="19050" distL="19050" distR="19050">
             <wp:extent cx="132080" cy="158496"/>
             <wp:effectExtent b="0" l="0" r="0" t="0"/>
-            <wp:docPr descr="linkedin" id="2" name="image1.png"/>
+            <wp:docPr descr="linkedin" id="2" name="image3.png"/>
             <a:graphic>
               <a:graphicData uri="http://schemas.openxmlformats.org/drawingml/2006/picture">
                 <pic:pic>
                   <pic:nvPicPr>
-                    <pic:cNvPr descr="linkedin" id="0" name="image1.png"/>
+                    <pic:cNvPr descr="linkedin" id="0" name="image3.png"/>
                     <pic:cNvPicPr preferRelativeResize="0"/>
                   </pic:nvPicPr>
                   <pic:blipFill>
@@ -328,7 +328,7 @@
         <w:rPr>
           <w:rtl w:val="0"/>
         </w:rPr>
-        <w:t xml:space="preserve">Developing, improving and creating React components using Redux, Redux Sagas and TypeScript.</w:t>
+        <w:t xml:space="preserve">Developing, improving and creating React components using Redux, Redux Sagas and TypeScript for the company’s non-custodial wallet.</w:t>
       </w:r>
     </w:p>
     <w:p>
@@ -372,7 +372,13 @@
         <w:rPr>
           <w:rtl w:val="0"/>
         </w:rPr>
-        <w:t xml:space="preserve">Maintain and improve an app for managing client’s (Corning, Starbucks, Philips, Dyson, BASF, Barilla, etc) incidents and sensitive data.</w:t>
+        <w:t xml:space="preserve">Optimized and enhanced company’s </w:t>
+      </w:r>
+      <w:r>
+        <w:rPr>
+          <w:rtl w:val="0"/>
+        </w:rPr>
+        <w:t xml:space="preserve">app for managing client’s (Corning, Starbucks, Philips, Dyson, BASF, Barilla, etc) incidents and sensitive data and reduced loading times about 50%.</w:t>
       </w:r>
     </w:p>
     <w:p>
@@ -390,7 +396,7 @@
         <w:rPr>
           <w:rtl w:val="0"/>
         </w:rPr>
-        <w:t xml:space="preserve">Lead and created a React app to manage customers warehouses, shipments and inventory and show a summarized panel with key information.</w:t>
+        <w:t xml:space="preserve">Lead and created a React app to manage customers warehouses, shipments and inventory and show a summarized panel with key information using DRY and KISS philosophy.</w:t>
       </w:r>
     </w:p>
     <w:p>
@@ -408,7 +414,7 @@
         <w:rPr>
           <w:rtl w:val="0"/>
         </w:rPr>
-        <w:t xml:space="preserve">Worked on a company component library using webpack’s new Federation Module to ensure code reusability and one time loading dependencies.</w:t>
+        <w:t xml:space="preserve">Created an useful component library using webpack’s new Federation Module to ensure code reusability and one time loading dependencies.</w:t>
       </w:r>
     </w:p>
     <w:p>
@@ -452,7 +458,13 @@
         <w:rPr>
           <w:rtl w:val="0"/>
         </w:rPr>
-        <w:t xml:space="preserve">Worked for Deloitte on an internal project for resource management all made in AngularJs (1.5) using components composability and SCSS.</w:t>
+        <w:t xml:space="preserve">Drop some major quality </w:t>
+      </w:r>
+      <w:r>
+        <w:rPr>
+          <w:rtl w:val="0"/>
+        </w:rPr>
+        <w:t xml:space="preserve">for Deloitte on an internal project for resource management written in AngularJs (1.5) using components composability, SCSS and unit testing.</w:t>
       </w:r>
     </w:p>
     <w:p>
@@ -470,25 +482,7 @@
         <w:rPr>
           <w:rtl w:val="0"/>
         </w:rPr>
-        <w:t xml:space="preserve">Worked for Thomas Cook on their tickets and CMS apps using AngularJs (1.3) and SCSS.</w:t>
-      </w:r>
-    </w:p>
-    <w:p>
-      <w:pPr>
-        <w:numPr>
-          <w:ilvl w:val="0"/>
-          <w:numId w:val="1"/>
-        </w:numPr>
-        <w:ind w:left="720" w:hanging="360"/>
-        <w:rPr>
-          <w:u w:val="none"/>
-        </w:rPr>
-      </w:pPr>
-      <w:r>
-        <w:rPr>
-          <w:rtl w:val="0"/>
-        </w:rPr>
-        <w:t xml:space="preserve">Worked for Walt Disney Company on their rework for desktop, and responsive of “Disney Cruise Line”, “Visa Instant Credit”, “FastPass Plus”, “FastFood Plus”, “My Disney Experience Itinerary” and “Disney Online Checkin” using AngularJs, PHP, Zend Framework, SCSS and SASS.</w:t>
+        <w:t xml:space="preserve">Hands on the 2.0 site for Walt Disney Company on their rework for desktop, and responsive of “Disney Cruise Line”, “Visa Instant Credit”, “FastPass Plus”, “FastFood Plus”, “My Disney Experience Itinerary” and “Disney Online Checkin” using AngularJs, PHP, SCSS and SASS.</w:t>
       </w:r>
     </w:p>
     <w:p>
@@ -647,25 +641,7 @@
         <w:rPr>
           <w:rtl w:val="0"/>
         </w:rPr>
-        <w:t xml:space="preserve">Javascript, React</w:t>
-      </w:r>
-    </w:p>
-    <w:p>
-      <w:pPr>
-        <w:rPr/>
-      </w:pPr>
-      <w:r>
-        <w:rPr>
-          <w:b w:val="1"/>
-          <w:rtl w:val="0"/>
-        </w:rPr>
-        <w:t xml:space="preserve">Other:</w:t>
-      </w:r>
-      <w:r>
-        <w:rPr>
-          <w:rtl w:val="0"/>
-        </w:rPr>
-        <w:t xml:space="preserve"> Git, Redux, Redux Sagas, Karma, Jasmine, Jest, Enzyme, ESLint, Styled-Components, Webpack, Rollup, MYSQL</w:t>
+        <w:t xml:space="preserve">Javascript, React, Git, Redux, Redux Sagas, Karma, Jasmine, Jest, Enzyme, ESLint, Styled-Components, Webpack, Rollup, MYSQL</w:t>
       </w:r>
     </w:p>
     <w:sectPr>

</xml_diff>